<commit_message>
feat(ai): persist media understanding in context
</commit_message>
<xml_diff>
--- a/docs/酒店AI店长与七鱼接入技术架构方案.docx
+++ b/docs/酒店AI店长与七鱼接入技术架构方案.docx
@@ -5321,6 +5321,220 @@
         <w:t>第三方接口返回数据说明：https://qiyukf.apifox.cn/doc-437036</w:t>
       </w:r>
     </w:p>
+    <w:p>
+      <w:r>
+        <w:br w:type="page"/>
+      </w:r>
+    </w:p>
+    <w:p>
+      <w:pPr>
+        <w:pStyle w:val="Heading1"/>
+      </w:pPr>
+      <w:r>
+        <w:t>14. 最新实现补充：企微员工号媒体理解与 AI 上下文</w:t>
+      </w:r>
+    </w:p>
+    <w:p>
+      <w:r>
+        <w:t>本节覆盖 2026-06-30 当前代码实现，优先级高于文档中仍残留的七鱼旧链路描述。企微员工号消息协议继续以 wework.apifox.cn/llms.txt 及其具体接口页为唯一依据。</w:t>
+      </w:r>
+    </w:p>
+    <w:p>
+      <w:pPr>
+        <w:pStyle w:val="ListBullet"/>
+      </w:pPr>
+      <w:r>
+        <w:t>媒体消息必须双轨处理：网页端仍按原始消息类型渲染图片、语音、文件、位置、小程序、GIF 等卡片；AI 上下文不读取 UI 文案，而是读取同一条消息 payload 内的结构化理解结果。</w:t>
+      </w:r>
+    </w:p>
+    <w:p>
+      <w:pPr>
+        <w:pStyle w:val="ListBullet"/>
+      </w:pPr>
+      <w:r>
+        <w:t>Message.payload 是媒体理解的唯一持久化载体。图片、语音、文件、视频、GIF 等理解完成后，必须写回 mediaText、mediaSummary、mediaUnderstandingStatus、mediaUnderstandingError。</w:t>
+      </w:r>
+    </w:p>
+    <w:p>
+      <w:pPr>
+        <w:pStyle w:val="ListBullet"/>
+      </w:pPr>
+      <w:r>
+        <w:t>AI 构建上下文统一调用 BuildRuntimeMessageTextWithPayload(messageType, content, payload)。例如网页显示仍是图片卡片，但 AI 看到的文本应包含“图片内容是：……”或“图片摘要是：……”。</w:t>
+      </w:r>
+    </w:p>
+    <w:p>
+      <w:pPr>
+        <w:pStyle w:val="ListBullet"/>
+      </w:pPr>
+      <w:r>
+        <w:t>理解结果优先级为 mediaText &gt; mediaSummary &gt; mediaUnderstandingStatus。有 mediaText 时按媒体类型写为“图片内容是”“语音内容是”“文件内容是”；只有摘要时写为“图片摘要是”等；失败或处理中只写状态。</w:t>
+      </w:r>
+    </w:p>
+    <w:p>
+      <w:pPr>
+        <w:pStyle w:val="ListBullet"/>
+      </w:pPr>
+      <w:r>
+        <w:t>媒体理解完成后后端发布 message.updated 实时事件；前端只替换该消息的 payload/content，不改变消息气泡类型，保证客服看到的仍是原始媒体。</w:t>
+      </w:r>
+    </w:p>
+    <w:p>
+      <w:pPr>
+        <w:pStyle w:val="ListBullet"/>
+      </w:pPr>
+      <w:r>
+        <w:t>后续会话、上下文压缩、知识进化和人工复盘都读取持久化 payload，不读取临时变量；客户隔几条消息追问“刚才图片里那个是什么”时，AI 仍能看到之前图片的理解结果。</w:t>
+      </w:r>
+    </w:p>
+    <w:p>
+      <w:pPr>
+        <w:pStyle w:val="ListBullet"/>
+      </w:pPr>
+      <w:r>
+        <w:t>如果视觉理解、文件解析或语音翻译失败，payload 中必须记录失败状态和错误原因；AI 只能说明无法确认并追问或转人工，不能假装看懂。</w:t>
+      </w:r>
+    </w:p>
+    <w:tbl>
+      <w:tblPr>
+        <w:tblStyle w:val="TableGrid"/>
+        <w:tblW w:type="auto" w:w="0"/>
+        <w:tblLook w:firstColumn="1" w:firstRow="1" w:lastColumn="0" w:lastRow="0" w:noHBand="0" w:noVBand="1" w:val="04A0"/>
+      </w:tblPr>
+      <w:tblGrid>
+        <w:gridCol w:w="3120"/>
+        <w:gridCol w:w="3120"/>
+        <w:gridCol w:w="3120"/>
+      </w:tblGrid>
+      <w:tr>
+        <w:tc>
+          <w:tcPr>
+            <w:tcW w:type="dxa" w:w="3120"/>
+          </w:tcPr>
+          <w:p>
+            <w:r>
+              <w:t>位置</w:t>
+            </w:r>
+          </w:p>
+        </w:tc>
+        <w:tc>
+          <w:tcPr>
+            <w:tcW w:type="dxa" w:w="3120"/>
+          </w:tcPr>
+          <w:p>
+            <w:r>
+              <w:t>职责</w:t>
+            </w:r>
+          </w:p>
+        </w:tc>
+        <w:tc>
+          <w:tcPr>
+            <w:tcW w:type="dxa" w:w="3120"/>
+          </w:tcPr>
+          <w:p>
+            <w:r>
+              <w:t>关键约束</w:t>
+            </w:r>
+          </w:p>
+        </w:tc>
+      </w:tr>
+      <w:tr>
+        <w:tc>
+          <w:tcPr>
+            <w:tcW w:type="dxa" w:w="3120"/>
+          </w:tcPr>
+          <w:p>
+            <w:r>
+              <w:t>MediaUnderstandingService</w:t>
+            </w:r>
+          </w:p>
+        </w:tc>
+        <w:tc>
+          <w:tcPr>
+            <w:tcW w:type="dxa" w:w="3120"/>
+          </w:tcPr>
+          <w:p>
+            <w:r>
+              <w:t>下载/解析媒体并写回 Message.payload</w:t>
+            </w:r>
+          </w:p>
+        </w:tc>
+        <w:tc>
+          <w:tcPr>
+            <w:tcW w:type="dxa" w:w="3120"/>
+          </w:tcPr>
+          <w:p>
+            <w:r>
+              <w:t>理解完成后发布 message.updated，失败也写状态</w:t>
+            </w:r>
+          </w:p>
+        </w:tc>
+      </w:tr>
+      <w:tr>
+        <w:tc>
+          <w:tcPr>
+            <w:tcW w:type="dxa" w:w="3120"/>
+          </w:tcPr>
+          <w:p>
+            <w:r>
+              <w:t>BuildRuntimeMessageTextWithPayload</w:t>
+            </w:r>
+          </w:p>
+        </w:tc>
+        <w:tc>
+          <w:tcPr>
+            <w:tcW w:type="dxa" w:w="3120"/>
+          </w:tcPr>
+          <w:p>
+            <w:r>
+              <w:t>把媒体 payload 转成 AI 可读上下文</w:t>
+            </w:r>
+          </w:p>
+        </w:tc>
+        <w:tc>
+          <w:tcPr>
+            <w:tcW w:type="dxa" w:w="3120"/>
+          </w:tcPr>
+          <w:p>
+            <w:r>
+              <w:t>保留原始媒体标记，并追加“图片内容是”等说明</w:t>
+            </w:r>
+          </w:p>
+        </w:tc>
+      </w:tr>
+      <w:tr>
+        <w:tc>
+          <w:tcPr>
+            <w:tcW w:type="dxa" w:w="3120"/>
+          </w:tcPr>
+          <w:p>
+            <w:r>
+              <w:t>前端消息渲染</w:t>
+            </w:r>
+          </w:p>
+        </w:tc>
+        <w:tc>
+          <w:tcPr>
+            <w:tcW w:type="dxa" w:w="3120"/>
+          </w:tcPr>
+          <w:p>
+            <w:r>
+              <w:t>继续按 image/voice/file/location 等类型显示</w:t>
+            </w:r>
+          </w:p>
+        </w:tc>
+        <w:tc>
+          <w:tcPr>
+            <w:tcW w:type="dxa" w:w="3120"/>
+          </w:tcPr>
+          <w:p>
+            <w:r>
+              <w:t>message.updated 只刷新 payload，不把媒体改成普通文本</w:t>
+            </w:r>
+          </w:p>
+        </w:tc>
+      </w:tr>
+    </w:tbl>
     <w:sectPr>
       <w:footerReference w:type="default" r:id="rId9"/>
       <w:pgSz w:w="12240" w:h="15840"/>

</xml_diff>

<commit_message>
fix(ai): route non-knowledge replies before fallback
</commit_message>
<xml_diff>
--- a/docs/酒店AI店长与七鱼接入技术架构方案.docx
+++ b/docs/酒店AI店长与七鱼接入技术架构方案.docx
@@ -574,12 +574,12 @@
     <w:p>
       <w:pPr>
         <w:spacing w:after="120"/>
-        <w:ind w:left="259"/>
-      </w:pPr>
-      <w:r>
-        <w:rPr>
-          <w:rFonts w:ascii="Menlo" w:hAnsi="Menlo" w:eastAsia="Menlo"/>
-          <w:sz w:val="17"/>
+        <w:ind w:left="173"/>
+      </w:pPr>
+      <w:r>
+        <w:rPr>
+          <w:rFonts w:ascii="Menlo" w:hAnsi="Menlo" w:eastAsia="Menlo"/>
+          <w:sz w:val="16"/>
         </w:rPr>
         <w:t>flowchart TD</w:t>
       </w:r>
@@ -589,7 +589,7 @@
       <w:r>
         <w:rPr>
           <w:rFonts w:ascii="Menlo" w:hAnsi="Menlo" w:eastAsia="Menlo"/>
-          <w:sz w:val="17"/>
+          <w:sz w:val="16"/>
         </w:rPr>
         <w:t xml:space="preserve">  A[客人发到门店员工号] --&gt; B[协议 SAAS 回调 AgentDesk]</w:t>
       </w:r>
@@ -599,7 +599,7 @@
       <w:r>
         <w:rPr>
           <w:rFonts w:ascii="Menlo" w:hAnsi="Menlo" w:eastAsia="Menlo"/>
-          <w:sz w:val="17"/>
+          <w:sz w:val="16"/>
         </w:rPr>
         <w:t xml:space="preserve">  B --&gt; C{guid 是否绑定门店和知识库}</w:t>
       </w:r>
@@ -609,7 +609,7 @@
       <w:r>
         <w:rPr>
           <w:rFonts w:ascii="Menlo" w:hAnsi="Menlo" w:eastAsia="Menlo"/>
-          <w:sz w:val="17"/>
+          <w:sz w:val="16"/>
         </w:rPr>
         <w:t xml:space="preserve">  C -- 是 --&gt; D[storeId -&gt; knowledgeBaseId]</w:t>
       </w:r>
@@ -619,7 +619,7 @@
       <w:r>
         <w:rPr>
           <w:rFonts w:ascii="Menlo" w:hAnsi="Menlo" w:eastAsia="Menlo"/>
-          <w:sz w:val="17"/>
+          <w:sz w:val="16"/>
         </w:rPr>
         <w:t xml:space="preserve">  D --&gt; E[AI 只检索当前门店知识库]</w:t>
       </w:r>
@@ -629,7 +629,7 @@
       <w:r>
         <w:rPr>
           <w:rFonts w:ascii="Menlo" w:hAnsi="Menlo" w:eastAsia="Menlo"/>
-          <w:sz w:val="17"/>
+          <w:sz w:val="16"/>
         </w:rPr>
         <w:t xml:space="preserve">  E --&gt; F[Outbox 发回原员工号会话]</w:t>
       </w:r>
@@ -639,7 +639,7 @@
       <w:r>
         <w:rPr>
           <w:rFonts w:ascii="Menlo" w:hAnsi="Menlo" w:eastAsia="Menlo"/>
-          <w:sz w:val="17"/>
+          <w:sz w:val="16"/>
         </w:rPr>
         <w:t xml:space="preserve">  C -- 否 --&gt; G[配置告警 + 固定兜底]</w:t>
       </w:r>
@@ -649,7 +649,7 @@
       <w:r>
         <w:rPr>
           <w:rFonts w:ascii="Menlo" w:hAnsi="Menlo" w:eastAsia="Menlo"/>
-          <w:sz w:val="17"/>
+          <w:sz w:val="16"/>
         </w:rPr>
         <w:t xml:space="preserve">  G --&gt; H[回复: 当前门店配置异常 已通知人工处理]</w:t>
       </w:r>
@@ -1934,14 +1934,14 @@
     <w:p>
       <w:pPr>
         <w:spacing w:after="120"/>
-        <w:ind w:left="259"/>
-      </w:pPr>
-      <w:r>
-        <w:rPr>
-          <w:rFonts w:ascii="Menlo" w:hAnsi="Menlo" w:eastAsia="Menlo"/>
-          <w:sz w:val="17"/>
-        </w:rPr>
-        <w:t>sequenceDiagram</w:t>
+        <w:ind w:left="173"/>
+      </w:pPr>
+      <w:r>
+        <w:rPr>
+          <w:rFonts w:ascii="Menlo" w:hAnsi="Menlo" w:eastAsia="Menlo"/>
+          <w:sz w:val="16"/>
+        </w:rPr>
+        <w:t>flowchart TD</w:t>
       </w:r>
       <w:r>
         <w:br/>
@@ -1949,9 +1949,9 @@
       <w:r>
         <w:rPr>
           <w:rFonts w:ascii="Menlo" w:hAnsi="Menlo" w:eastAsia="Menlo"/>
-          <w:sz w:val="17"/>
-        </w:rPr>
-        <w:t xml:space="preserve">  participant C as 客户微信</w:t>
+          <w:sz w:val="16"/>
+        </w:rPr>
+        <w:t xml:space="preserve">  A[客户消息进入 AgentDesk] --&gt; B[落库 去重 echo过滤 session/window]</w:t>
       </w:r>
       <w:r>
         <w:br/>
@@ -1959,9 +1959,9 @@
       <w:r>
         <w:rPr>
           <w:rFonts w:ascii="Menlo" w:hAnsi="Menlo" w:eastAsia="Menlo"/>
-          <w:sz w:val="17"/>
-        </w:rPr>
-        <w:t xml:space="preserve">  participant W as 门店员工号/协议SAAS</w:t>
+          <w:sz w:val="16"/>
+        </w:rPr>
+        <w:t xml:space="preserve">  B --&gt; C[合并短时间连续客户消息]</w:t>
       </w:r>
       <w:r>
         <w:br/>
@@ -1969,9 +1969,9 @@
       <w:r>
         <w:rPr>
           <w:rFonts w:ascii="Menlo" w:hAnsi="Menlo" w:eastAsia="Menlo"/>
-          <w:sz w:val="17"/>
-        </w:rPr>
-        <w:t xml:space="preserve">  participant A as AgentDesk</w:t>
+          <w:sz w:val="16"/>
+        </w:rPr>
+        <w:t xml:space="preserve">  C --&gt; D[补齐媒体上下文 mediaText/mediaSummary]</w:t>
       </w:r>
       <w:r>
         <w:br/>
@@ -1979,9 +1979,9 @@
       <w:r>
         <w:rPr>
           <w:rFonts w:ascii="Menlo" w:hAnsi="Menlo" w:eastAsia="Menlo"/>
-          <w:sz w:val="17"/>
-        </w:rPr>
-        <w:t xml:space="preserve">  participant K as 门店知识库</w:t>
+          <w:sz w:val="16"/>
+        </w:rPr>
+        <w:t xml:space="preserve">  D --&gt; E{当前是否人工/AI关闭/无Agent配置}</w:t>
       </w:r>
       <w:r>
         <w:br/>
@@ -1989,9 +1989,9 @@
       <w:r>
         <w:rPr>
           <w:rFonts w:ascii="Menlo" w:hAnsi="Menlo" w:eastAsia="Menlo"/>
-          <w:sz w:val="17"/>
-        </w:rPr>
-        <w:t xml:space="preserve">  participant O as Outbox</w:t>
+          <w:sz w:val="16"/>
+        </w:rPr>
+        <w:t xml:space="preserve">  E -- 是 --&gt; E1[不触发AI 进入人工或配置告警]</w:t>
       </w:r>
       <w:r>
         <w:br/>
@@ -1999,8 +1999,9 @@
       <w:r>
         <w:rPr>
           <w:rFonts w:ascii="Menlo" w:hAnsi="Menlo" w:eastAsia="Menlo"/>
-          <w:sz w:val="17"/>
-        </w:rPr>
+          <w:sz w:val="16"/>
+        </w:rPr>
+        <w:t xml:space="preserve">  E -- 否 --&gt; F{轻量意图分类}</w:t>
       </w:r>
       <w:r>
         <w:br/>
@@ -2008,9 +2009,9 @@
       <w:r>
         <w:rPr>
           <w:rFonts w:ascii="Menlo" w:hAnsi="Menlo" w:eastAsia="Menlo"/>
-          <w:sz w:val="17"/>
-        </w:rPr>
-        <w:t xml:space="preserve">  C-&gt;&gt;W: 发消息</w:t>
+          <w:sz w:val="16"/>
+        </w:rPr>
+        <w:t xml:space="preserve">  F -- 寒暄/确认/感谢/闲聊 --&gt; G[跳过知识库 自然短句回复]</w:t>
       </w:r>
       <w:r>
         <w:br/>
@@ -2018,9 +2019,9 @@
       <w:r>
         <w:rPr>
           <w:rFonts w:ascii="Menlo" w:hAnsi="Menlo" w:eastAsia="Menlo"/>
-          <w:sz w:val="17"/>
-        </w:rPr>
-        <w:t xml:space="preserve">  W-&gt;&gt;A: notify 1010/1011 ChatMsgModel</w:t>
+          <w:sz w:val="16"/>
+        </w:rPr>
+        <w:t xml:space="preserve">  F -- 小程序/入住/定位/导航 --&gt; H[走门店默认资源/定位能力]</w:t>
       </w:r>
       <w:r>
         <w:br/>
@@ -2028,9 +2029,9 @@
       <w:r>
         <w:rPr>
           <w:rFonts w:ascii="Menlo" w:hAnsi="Menlo" w:eastAsia="Menlo"/>
-          <w:sz w:val="17"/>
-        </w:rPr>
-        <w:t xml:space="preserve">  A-&gt;&gt;A: guid+客户username 找长期会话</w:t>
+          <w:sz w:val="16"/>
+        </w:rPr>
+        <w:t xml:space="preserve">  F -- 送物/维修/保洁/投诉/高风险 --&gt; I[追问必要字段或转人工 不空口承诺]</w:t>
       </w:r>
       <w:r>
         <w:br/>
@@ -2038,9 +2039,9 @@
       <w:r>
         <w:rPr>
           <w:rFonts w:ascii="Menlo" w:hAnsi="Menlo" w:eastAsia="Menlo"/>
-          <w:sz w:val="17"/>
-        </w:rPr>
-        <w:t xml:space="preserve">  A-&gt;&gt;A: 判断 sessionNo / 去重 / echo过滤</w:t>
+          <w:sz w:val="16"/>
+        </w:rPr>
+        <w:t xml:space="preserve">  F -- 图片/语音/文件追问 --&gt; J{payload已有理解结果?}</w:t>
       </w:r>
       <w:r>
         <w:br/>
@@ -2048,9 +2049,9 @@
       <w:r>
         <w:rPr>
           <w:rFonts w:ascii="Menlo" w:hAnsi="Menlo" w:eastAsia="Menlo"/>
-          <w:sz w:val="17"/>
-        </w:rPr>
-        <w:t xml:space="preserve">  A-&gt;&gt;K: 只检索当前门店 knowledgeBaseId</w:t>
+          <w:sz w:val="16"/>
+        </w:rPr>
+        <w:t xml:space="preserve">  J -- 有 --&gt; J1[结合媒体理解自然回答]</w:t>
       </w:r>
       <w:r>
         <w:br/>
@@ -2058,9 +2059,9 @@
       <w:r>
         <w:rPr>
           <w:rFonts w:ascii="Menlo" w:hAnsi="Menlo" w:eastAsia="Menlo"/>
-          <w:sz w:val="17"/>
-        </w:rPr>
-        <w:t xml:space="preserve">  K--&gt;&gt;A: 命中内容</w:t>
+          <w:sz w:val="16"/>
+        </w:rPr>
+        <w:t xml:space="preserve">  J -- 无 --&gt; J2[说明需要补充/稍后再看 不编造]</w:t>
       </w:r>
       <w:r>
         <w:br/>
@@ -2068,9 +2069,9 @@
       <w:r>
         <w:rPr>
           <w:rFonts w:ascii="Menlo" w:hAnsi="Menlo" w:eastAsia="Menlo"/>
-          <w:sz w:val="17"/>
-        </w:rPr>
-        <w:t xml:space="preserve">  A-&gt;&gt;A: 生成自然前台同事风格回复</w:t>
+          <w:sz w:val="16"/>
+        </w:rPr>
+        <w:t xml:space="preserve">  F -- 酒店事实/规则/价格/政策/FAQ --&gt; K[只检索当前门店知识库]</w:t>
       </w:r>
       <w:r>
         <w:br/>
@@ -2078,9 +2079,9 @@
       <w:r>
         <w:rPr>
           <w:rFonts w:ascii="Menlo" w:hAnsi="Menlo" w:eastAsia="Menlo"/>
-          <w:sz w:val="17"/>
-        </w:rPr>
-        <w:t xml:space="preserve">  A-&gt;&gt;O: 写 ChannelMessageOutbox</w:t>
+          <w:sz w:val="16"/>
+        </w:rPr>
+        <w:t xml:space="preserve">  K --&gt; L{命中可信片段?}</w:t>
       </w:r>
       <w:r>
         <w:br/>
@@ -2088,9 +2089,9 @@
       <w:r>
         <w:rPr>
           <w:rFonts w:ascii="Menlo" w:hAnsi="Menlo" w:eastAsia="Menlo"/>
-          <w:sz w:val="17"/>
-        </w:rPr>
-        <w:t xml:space="preserve">  O-&gt;&gt;W: /msg/send_text</w:t>
+          <w:sz w:val="16"/>
+        </w:rPr>
+        <w:t xml:space="preserve">  L -- 是 --&gt; M[按知识片段回答 不说根据知识库]</w:t>
       </w:r>
       <w:r>
         <w:br/>
@@ -2098,9 +2099,9 @@
       <w:r>
         <w:rPr>
           <w:rFonts w:ascii="Menlo" w:hAnsi="Menlo" w:eastAsia="Menlo"/>
-          <w:sz w:val="17"/>
-        </w:rPr>
-        <w:t xml:space="preserve">  W-&gt;&gt;C: 客户收到回复</w:t>
+          <w:sz w:val="16"/>
+        </w:rPr>
+        <w:t xml:space="preserve">  L -- 否 --&gt; N[只在该类问题上简短兜底/追问/转人工]</w:t>
       </w:r>
       <w:r>
         <w:br/>
@@ -2108,9 +2109,9 @@
       <w:r>
         <w:rPr>
           <w:rFonts w:ascii="Menlo" w:hAnsi="Menlo" w:eastAsia="Menlo"/>
-          <w:sz w:val="17"/>
-        </w:rPr>
-        <w:t xml:space="preserve">  W--&gt;&gt;A: echo 回调</w:t>
+          <w:sz w:val="16"/>
+        </w:rPr>
+        <w:t xml:space="preserve">  G --&gt; O[写出站消息]</w:t>
       </w:r>
       <w:r>
         <w:br/>
@@ -2118,9 +2119,97 @@
       <w:r>
         <w:rPr>
           <w:rFonts w:ascii="Menlo" w:hAnsi="Menlo" w:eastAsia="Menlo"/>
-          <w:sz w:val="17"/>
-        </w:rPr>
-        <w:t xml:space="preserve">  A-&gt;&gt;A: 仅确认发送状态 不重复入库</w:t>
+          <w:sz w:val="16"/>
+        </w:rPr>
+        <w:t xml:space="preserve">  H --&gt; O</w:t>
+      </w:r>
+      <w:r>
+        <w:br/>
+      </w:r>
+      <w:r>
+        <w:rPr>
+          <w:rFonts w:ascii="Menlo" w:hAnsi="Menlo" w:eastAsia="Menlo"/>
+          <w:sz w:val="16"/>
+        </w:rPr>
+        <w:t xml:space="preserve">  I --&gt; O</w:t>
+      </w:r>
+      <w:r>
+        <w:br/>
+      </w:r>
+      <w:r>
+        <w:rPr>
+          <w:rFonts w:ascii="Menlo" w:hAnsi="Menlo" w:eastAsia="Menlo"/>
+          <w:sz w:val="16"/>
+        </w:rPr>
+        <w:t xml:space="preserve">  J1 --&gt; O</w:t>
+      </w:r>
+      <w:r>
+        <w:br/>
+      </w:r>
+      <w:r>
+        <w:rPr>
+          <w:rFonts w:ascii="Menlo" w:hAnsi="Menlo" w:eastAsia="Menlo"/>
+          <w:sz w:val="16"/>
+        </w:rPr>
+        <w:t xml:space="preserve">  J2 --&gt; O</w:t>
+      </w:r>
+      <w:r>
+        <w:br/>
+      </w:r>
+      <w:r>
+        <w:rPr>
+          <w:rFonts w:ascii="Menlo" w:hAnsi="Menlo" w:eastAsia="Menlo"/>
+          <w:sz w:val="16"/>
+        </w:rPr>
+        <w:t xml:space="preserve">  M --&gt; O</w:t>
+      </w:r>
+      <w:r>
+        <w:br/>
+      </w:r>
+      <w:r>
+        <w:rPr>
+          <w:rFonts w:ascii="Menlo" w:hAnsi="Menlo" w:eastAsia="Menlo"/>
+          <w:sz w:val="16"/>
+        </w:rPr>
+        <w:t xml:space="preserve">  N --&gt; O</w:t>
+      </w:r>
+      <w:r>
+        <w:br/>
+      </w:r>
+      <w:r>
+        <w:rPr>
+          <w:rFonts w:ascii="Menlo" w:hAnsi="Menlo" w:eastAsia="Menlo"/>
+          <w:sz w:val="16"/>
+        </w:rPr>
+        <w:t xml:space="preserve">  O --&gt; P[wxwork outbox 按 wework 接口发送]</w:t>
+      </w:r>
+      <w:r>
+        <w:br/>
+      </w:r>
+      <w:r>
+        <w:rPr>
+          <w:rFonts w:ascii="Menlo" w:hAnsi="Menlo" w:eastAsia="Menlo"/>
+          <w:sz w:val="16"/>
+        </w:rPr>
+        <w:t xml:space="preserve">  P --&gt; Q[echo回调只确认 不重复入库]</w:t>
+      </w:r>
+    </w:p>
+    <w:p>
+      <w:r>
+        <w:t>新的回答链路必须先做意图分类，再决定是否进入知识库。知识库不再是所有消息的第一道门，因此“你好”“确认”“发定位”“发小程序”“帮我看下图片”“送两瓶水”等消息不会因为知识库没命中而被莫名兜底。只有客户询问酒店事实、规则、价格、政策、时效、设施等需要资料支撑的问题，才进入知识库检索；这类问题如果没有命中可信片段，才允许简短兜底、追问或转人工。</w:t>
+      </w:r>
+    </w:p>
+    <w:p>
+      <w:r>
+        <w:rPr>
+          <w:rFonts w:ascii="Menlo" w:hAnsi="Menlo" w:eastAsia="Menlo"/>
+          <w:color w:val="10786E"/>
+          <w:sz w:val="18"/>
+        </w:rPr>
+        <w:t>KnowledgeAnswerabilityGate</w:t>
+      </w:r>
+      <w:r>
+        <w:t xml:space="preserve"> 的职责只限于“知识类问题的可信资料约束”。它必须跳过以下类型：寒暄确认、运行时动作意图、门店默认资源意图、小程序/定位/导航、真实员工动作、纯媒体消息和媒体追问。跳过 gate 不代表不智能，而是让 Agent 按上下文、工具和自然对话继续处理。</w:t>
       </w:r>
     </w:p>
     <w:p>
@@ -3180,12 +3269,12 @@
     <w:p>
       <w:pPr>
         <w:spacing w:after="120"/>
-        <w:ind w:left="259"/>
-      </w:pPr>
-      <w:r>
-        <w:rPr>
-          <w:rFonts w:ascii="Menlo" w:hAnsi="Menlo" w:eastAsia="Menlo"/>
-          <w:sz w:val="17"/>
+        <w:ind w:left="173"/>
+      </w:pPr>
+      <w:r>
+        <w:rPr>
+          <w:rFonts w:ascii="Menlo" w:hAnsi="Menlo" w:eastAsia="Menlo"/>
+          <w:sz w:val="16"/>
         </w:rPr>
         <w:t>flowchart LR</w:t>
       </w:r>
@@ -3195,7 +3284,7 @@
       <w:r>
         <w:rPr>
           <w:rFonts w:ascii="Menlo" w:hAnsi="Menlo" w:eastAsia="Menlo"/>
-          <w:sz w:val="17"/>
+          <w:sz w:val="16"/>
         </w:rPr>
         <w:t xml:space="preserve">  A[客户 -&gt; 门店企微员工号] --&gt; B[协议回调 AgentDesk]</w:t>
       </w:r>
@@ -3205,7 +3294,7 @@
       <w:r>
         <w:rPr>
           <w:rFonts w:ascii="Menlo" w:hAnsi="Menlo" w:eastAsia="Menlo"/>
-          <w:sz w:val="17"/>
+          <w:sz w:val="16"/>
         </w:rPr>
         <w:t xml:space="preserve">  B --&gt; C[(Message 表)]</w:t>
       </w:r>
@@ -3215,7 +3304,7 @@
       <w:r>
         <w:rPr>
           <w:rFonts w:ascii="Menlo" w:hAnsi="Menlo" w:eastAsia="Menlo"/>
-          <w:sz w:val="17"/>
+          <w:sz w:val="16"/>
         </w:rPr>
         <w:t xml:space="preserve">  C --&gt; D{当前路由}</w:t>
       </w:r>
@@ -3225,7 +3314,7 @@
       <w:r>
         <w:rPr>
           <w:rFonts w:ascii="Menlo" w:hAnsi="Menlo" w:eastAsia="Menlo"/>
-          <w:sz w:val="17"/>
+          <w:sz w:val="16"/>
         </w:rPr>
         <w:t xml:space="preserve">  D -- AI_SERVING --&gt; E[AI 回复]</w:t>
       </w:r>
@@ -3235,7 +3324,7 @@
       <w:r>
         <w:rPr>
           <w:rFonts w:ascii="Menlo" w:hAnsi="Menlo" w:eastAsia="Menlo"/>
-          <w:sz w:val="17"/>
+          <w:sz w:val="16"/>
         </w:rPr>
         <w:t xml:space="preserve">  E --&gt; F[Outbox -&gt; 原门店企微]</w:t>
       </w:r>
@@ -3245,7 +3334,7 @@
       <w:r>
         <w:rPr>
           <w:rFonts w:ascii="Menlo" w:hAnsi="Menlo" w:eastAsia="Menlo"/>
-          <w:sz w:val="17"/>
+          <w:sz w:val="16"/>
         </w:rPr>
         <w:t xml:space="preserve">  D -- STORE_WECOM_MANUAL --&gt; G[门店员工企微手动回复]</w:t>
       </w:r>
@@ -3255,7 +3344,7 @@
       <w:r>
         <w:rPr>
           <w:rFonts w:ascii="Menlo" w:hAnsi="Menlo" w:eastAsia="Menlo"/>
-          <w:sz w:val="17"/>
+          <w:sz w:val="16"/>
         </w:rPr>
         <w:t xml:space="preserve">  G --&gt; B</w:t>
       </w:r>
@@ -3265,7 +3354,7 @@
       <w:r>
         <w:rPr>
           <w:rFonts w:ascii="Menlo" w:hAnsi="Menlo" w:eastAsia="Menlo"/>
-          <w:sz w:val="17"/>
+          <w:sz w:val="16"/>
         </w:rPr>
         <w:t xml:space="preserve">  D -- HQ_AGENTDESK_SERVING --&gt; H[总部网页客服回复]</w:t>
       </w:r>
@@ -3275,7 +3364,7 @@
       <w:r>
         <w:rPr>
           <w:rFonts w:ascii="Menlo" w:hAnsi="Menlo" w:eastAsia="Menlo"/>
-          <w:sz w:val="17"/>
+          <w:sz w:val="16"/>
         </w:rPr>
         <w:t xml:space="preserve">  H --&gt; F</w:t>
       </w:r>
@@ -6932,12 +7021,12 @@
     <w:p>
       <w:pPr>
         <w:spacing w:after="120"/>
-        <w:ind w:left="259"/>
-      </w:pPr>
-      <w:r>
-        <w:rPr>
-          <w:rFonts w:ascii="Menlo" w:hAnsi="Menlo" w:eastAsia="Menlo"/>
-          <w:sz w:val="17"/>
+        <w:ind w:left="173"/>
+      </w:pPr>
+      <w:r>
+        <w:rPr>
+          <w:rFonts w:ascii="Menlo" w:hAnsi="Menlo" w:eastAsia="Menlo"/>
+          <w:sz w:val="16"/>
         </w:rPr>
         <w:t>flowchart TD</w:t>
       </w:r>
@@ -6947,7 +7036,7 @@
       <w:r>
         <w:rPr>
           <w:rFonts w:ascii="Menlo" w:hAnsi="Menlo" w:eastAsia="Menlo"/>
-          <w:sz w:val="17"/>
+          <w:sz w:val="16"/>
         </w:rPr>
         <w:t xml:space="preserve">  A[网页客服选择文件] --&gt; B[AgentDesk 创建 Asset]</w:t>
       </w:r>
@@ -6957,7 +7046,7 @@
       <w:r>
         <w:rPr>
           <w:rFonts w:ascii="Menlo" w:hAnsi="Menlo" w:eastAsia="Menlo"/>
-          <w:sz w:val="17"/>
+          <w:sz w:val="16"/>
         </w:rPr>
         <w:t xml:space="preserve">  B --&gt; C[上传到 OSS: desk/...]</w:t>
       </w:r>
@@ -6967,7 +7056,7 @@
       <w:r>
         <w:rPr>
           <w:rFonts w:ascii="Menlo" w:hAnsi="Menlo" w:eastAsia="Menlo"/>
-          <w:sz w:val="17"/>
+          <w:sz w:val="16"/>
         </w:rPr>
         <w:t xml:space="preserve">  C --&gt; D[生成公网资产 URL /api/asset/file/{assetId}]</w:t>
       </w:r>
@@ -6977,7 +7066,7 @@
       <w:r>
         <w:rPr>
           <w:rFonts w:ascii="Menlo" w:hAnsi="Menlo" w:eastAsia="Menlo"/>
-          <w:sz w:val="17"/>
+          <w:sz w:val="16"/>
         </w:rPr>
         <w:t xml:space="preserve">  D --&gt; E[调用 wecdn_web /cloud/c2c_upload]</w:t>
       </w:r>
@@ -6987,7 +7076,7 @@
       <w:r>
         <w:rPr>
           <w:rFonts w:ascii="Menlo" w:hAnsi="Menlo" w:eastAsia="Menlo"/>
-          <w:sz w:val="17"/>
+          <w:sz w:val="16"/>
         </w:rPr>
         <w:t xml:space="preserve">  E --&gt; F[获得 file_id/aes_key/md5/size 等协议媒体字段]</w:t>
       </w:r>
@@ -6997,7 +7086,7 @@
       <w:r>
         <w:rPr>
           <w:rFonts w:ascii="Menlo" w:hAnsi="Menlo" w:eastAsia="Menlo"/>
-          <w:sz w:val="17"/>
+          <w:sz w:val="16"/>
         </w:rPr>
         <w:t xml:space="preserve">  F --&gt; G[调用 /msg/send_image 或 send_file 等真实发送接口]</w:t>
       </w:r>
@@ -7007,7 +7096,7 @@
       <w:r>
         <w:rPr>
           <w:rFonts w:ascii="Menlo" w:hAnsi="Menlo" w:eastAsia="Menlo"/>
-          <w:sz w:val="17"/>
+          <w:sz w:val="16"/>
         </w:rPr>
         <w:t xml:space="preserve">  G --&gt; H[平台 echo 回调只确认发送状态 不创建重复消息]</w:t>
       </w:r>
@@ -9819,12 +9908,12 @@
     <w:p>
       <w:pPr>
         <w:spacing w:after="120"/>
-        <w:ind w:left="259"/>
-      </w:pPr>
-      <w:r>
-        <w:rPr>
-          <w:rFonts w:ascii="Menlo" w:hAnsi="Menlo" w:eastAsia="Menlo"/>
-          <w:sz w:val="17"/>
+        <w:ind w:left="173"/>
+      </w:pPr>
+      <w:r>
+        <w:rPr>
+          <w:rFonts w:ascii="Menlo" w:hAnsi="Menlo" w:eastAsia="Menlo"/>
+          <w:sz w:val="16"/>
         </w:rPr>
         <w:t>flowchart LR</w:t>
       </w:r>
@@ -9834,7 +9923,7 @@
       <w:r>
         <w:rPr>
           <w:rFonts w:ascii="Menlo" w:hAnsi="Menlo" w:eastAsia="Menlo"/>
-          <w:sz w:val="17"/>
+          <w:sz w:val="16"/>
         </w:rPr>
         <w:t xml:space="preserve">  A[客户位置表达] --&gt; B{是否可直接发送门店定位}</w:t>
       </w:r>
@@ -9844,7 +9933,7 @@
       <w:r>
         <w:rPr>
           <w:rFonts w:ascii="Menlo" w:hAnsi="Menlo" w:eastAsia="Menlo"/>
-          <w:sz w:val="17"/>
+          <w:sz w:val="16"/>
         </w:rPr>
         <w:t xml:space="preserve">  B --&gt;|是| C[读取当前 WxWorkInstanceID 的 address/navigationName/lng/lat]</w:t>
       </w:r>
@@ -9854,7 +9943,7 @@
       <w:r>
         <w:rPr>
           <w:rFonts w:ascii="Menlo" w:hAnsi="Menlo" w:eastAsia="Menlo"/>
-          <w:sz w:val="17"/>
+          <w:sz w:val="16"/>
         </w:rPr>
         <w:t xml:space="preserve">  C --&gt; D[创建 location 类型 Message 和 Outbox]</w:t>
       </w:r>
@@ -9864,7 +9953,7 @@
       <w:r>
         <w:rPr>
           <w:rFonts w:ascii="Menlo" w:hAnsi="Menlo" w:eastAsia="Menlo"/>
-          <w:sz w:val="17"/>
+          <w:sz w:val="16"/>
         </w:rPr>
         <w:t xml:space="preserve">  D --&gt; E[协议 /msg/send_location 发回原员工号会话]</w:t>
       </w:r>
@@ -9874,7 +9963,7 @@
       <w:r>
         <w:rPr>
           <w:rFonts w:ascii="Menlo" w:hAnsi="Menlo" w:eastAsia="Menlo"/>
-          <w:sz w:val="17"/>
+          <w:sz w:val="16"/>
         </w:rPr>
         <w:t xml:space="preserve">  B --&gt;|否，需要更多上下文| F[交给账号独立智能客服自然回复/追问]</w:t>
       </w:r>
@@ -11797,12 +11886,12 @@
     <w:p>
       <w:pPr>
         <w:spacing w:after="120"/>
-        <w:ind w:left="259"/>
-      </w:pPr>
-      <w:r>
-        <w:rPr>
-          <w:rFonts w:ascii="Menlo" w:hAnsi="Menlo" w:eastAsia="Menlo"/>
-          <w:sz w:val="17"/>
+        <w:ind w:left="173"/>
+      </w:pPr>
+      <w:r>
+        <w:rPr>
+          <w:rFonts w:ascii="Menlo" w:hAnsi="Menlo" w:eastAsia="Menlo"/>
+          <w:sz w:val="16"/>
         </w:rPr>
         <w:t>flowchart TD</w:t>
       </w:r>
@@ -11812,7 +11901,7 @@
       <w:r>
         <w:rPr>
           <w:rFonts w:ascii="Menlo" w:hAnsi="Menlo" w:eastAsia="Menlo"/>
-          <w:sz w:val="17"/>
+          <w:sz w:val="16"/>
         </w:rPr>
         <w:t xml:space="preserve">  A[客户消息] --&gt; B{意图分类}</w:t>
       </w:r>
@@ -11822,7 +11911,7 @@
       <w:r>
         <w:rPr>
           <w:rFonts w:ascii="Menlo" w:hAnsi="Menlo" w:eastAsia="Menlo"/>
-          <w:sz w:val="17"/>
+          <w:sz w:val="16"/>
         </w:rPr>
         <w:t xml:space="preserve">  B --&gt;|FAQ_CHAT| C[查当前门店知识库并回复]</w:t>
       </w:r>
@@ -11832,7 +11921,7 @@
       <w:r>
         <w:rPr>
           <w:rFonts w:ascii="Menlo" w:hAnsi="Menlo" w:eastAsia="Menlo"/>
-          <w:sz w:val="17"/>
+          <w:sz w:val="16"/>
         </w:rPr>
         <w:t xml:space="preserve">  B --&gt;|INFO_CLARIFICATION| D[追问一个关键字段]</w:t>
       </w:r>
@@ -11842,7 +11931,7 @@
       <w:r>
         <w:rPr>
           <w:rFonts w:ascii="Menlo" w:hAnsi="Menlo" w:eastAsia="Menlo"/>
-          <w:sz w:val="17"/>
+          <w:sz w:val="16"/>
         </w:rPr>
         <w:t xml:space="preserve">  B --&gt;|SERVICE_TASK| E{房号/事项/数量/时间是否齐全}</w:t>
       </w:r>
@@ -11852,7 +11941,7 @@
       <w:r>
         <w:rPr>
           <w:rFonts w:ascii="Menlo" w:hAnsi="Menlo" w:eastAsia="Menlo"/>
-          <w:sz w:val="17"/>
+          <w:sz w:val="16"/>
         </w:rPr>
         <w:t xml:space="preserve">  E --&gt;|否| D</w:t>
       </w:r>
@@ -11862,7 +11951,7 @@
       <w:r>
         <w:rPr>
           <w:rFonts w:ascii="Menlo" w:hAnsi="Menlo" w:eastAsia="Menlo"/>
-          <w:sz w:val="17"/>
+          <w:sz w:val="16"/>
         </w:rPr>
         <w:t xml:space="preserve">  E --&gt;|是| F[prepare_ticket_draft]</w:t>
       </w:r>
@@ -11872,7 +11961,7 @@
       <w:r>
         <w:rPr>
           <w:rFonts w:ascii="Menlo" w:hAnsi="Menlo" w:eastAsia="Menlo"/>
-          <w:sz w:val="17"/>
+          <w:sz w:val="16"/>
         </w:rPr>
         <w:t xml:space="preserve">  F --&gt; G{ready}</w:t>
       </w:r>
@@ -11882,7 +11971,7 @@
       <w:r>
         <w:rPr>
           <w:rFonts w:ascii="Menlo" w:hAnsi="Menlo" w:eastAsia="Menlo"/>
-          <w:sz w:val="17"/>
+          <w:sz w:val="16"/>
         </w:rPr>
         <w:t xml:space="preserve">  G --&gt;|否| D</w:t>
       </w:r>
@@ -11892,7 +11981,7 @@
       <w:r>
         <w:rPr>
           <w:rFonts w:ascii="Menlo" w:hAnsi="Menlo" w:eastAsia="Menlo"/>
-          <w:sz w:val="17"/>
+          <w:sz w:val="16"/>
         </w:rPr>
         <w:t xml:space="preserve">  G --&gt;|是| H[create_ticket_with_confirmation]</w:t>
       </w:r>
@@ -11902,7 +11991,7 @@
       <w:r>
         <w:rPr>
           <w:rFonts w:ascii="Menlo" w:hAnsi="Menlo" w:eastAsia="Menlo"/>
-          <w:sz w:val="17"/>
+          <w:sz w:val="16"/>
         </w:rPr>
         <w:t xml:space="preserve">  H --&gt; I[工单成功后才告知已记录]</w:t>
       </w:r>
@@ -11912,7 +12001,7 @@
       <w:r>
         <w:rPr>
           <w:rFonts w:ascii="Menlo" w:hAnsi="Menlo" w:eastAsia="Menlo"/>
-          <w:sz w:val="17"/>
+          <w:sz w:val="16"/>
         </w:rPr>
         <w:t xml:space="preserve">  B --&gt;|HUMAN_DECISION| J[handoff_to_human 或网页人工接管]</w:t>
       </w:r>
@@ -11922,7 +12011,7 @@
       <w:r>
         <w:rPr>
           <w:rFonts w:ascii="Menlo" w:hAnsi="Menlo" w:eastAsia="Menlo"/>
-          <w:sz w:val="17"/>
+          <w:sz w:val="16"/>
         </w:rPr>
         <w:t xml:space="preserve">  B --&gt;|LOCATION_NAVIGATION| K{实例是否有坐标}</w:t>
       </w:r>
@@ -11932,7 +12021,7 @@
       <w:r>
         <w:rPr>
           <w:rFonts w:ascii="Menlo" w:hAnsi="Menlo" w:eastAsia="Menlo"/>
-          <w:sz w:val="17"/>
+          <w:sz w:val="16"/>
         </w:rPr>
         <w:t xml:space="preserve">  K --&gt;|有| L[/msg/send_location]</w:t>
       </w:r>
@@ -11942,7 +12031,7 @@
       <w:r>
         <w:rPr>
           <w:rFonts w:ascii="Menlo" w:hAnsi="Menlo" w:eastAsia="Menlo"/>
-          <w:sz w:val="17"/>
+          <w:sz w:val="16"/>
         </w:rPr>
         <w:t xml:space="preserve">  K --&gt;|无| J</w:t>
       </w:r>
@@ -11952,7 +12041,7 @@
       <w:r>
         <w:rPr>
           <w:rFonts w:ascii="Menlo" w:hAnsi="Menlo" w:eastAsia="Menlo"/>
-          <w:sz w:val="17"/>
+          <w:sz w:val="16"/>
         </w:rPr>
         <w:t xml:space="preserve">  B --&gt;|MEDIA_UNDERSTANDING| M{媒体是否解析成功}</w:t>
       </w:r>
@@ -11962,7 +12051,7 @@
       <w:r>
         <w:rPr>
           <w:rFonts w:ascii="Menlo" w:hAnsi="Menlo" w:eastAsia="Menlo"/>
-          <w:sz w:val="17"/>
+          <w:sz w:val="16"/>
         </w:rPr>
         <w:t xml:space="preserve">  M --&gt;|成功| C</w:t>
       </w:r>
@@ -11972,7 +12061,7 @@
       <w:r>
         <w:rPr>
           <w:rFonts w:ascii="Menlo" w:hAnsi="Menlo" w:eastAsia="Menlo"/>
-          <w:sz w:val="17"/>
+          <w:sz w:val="16"/>
         </w:rPr>
         <w:t xml:space="preserve">  M --&gt;|失败| J</w:t>
       </w:r>

</xml_diff>

<commit_message>
fix(ai): make replies faster and less templated
</commit_message>
<xml_diff>
--- a/docs/酒店AI店长与七鱼接入技术架构方案.docx
+++ b/docs/酒店AI店长与七鱼接入技术架构方案.docx
@@ -2210,6 +2210,38 @@
       </w:r>
       <w:r>
         <w:t xml:space="preserve"> 的职责只限于“知识类问题的可信资料约束”。它必须跳过以下类型：寒暄确认、运行时动作意图、门店默认资源意图、小程序/定位/导航、真实员工动作、纯媒体消息和媒体追问。跳过 gate 不代表不智能，而是让 Agent 按上下文、工具和自然对话继续处理。</w:t>
+      </w:r>
+    </w:p>
+    <w:p>
+      <w:r>
+        <w:t xml:space="preserve">回复速度规则：文本消息只做约 </w:t>
+      </w:r>
+      <w:r>
+        <w:rPr>
+          <w:rFonts w:ascii="Menlo" w:hAnsi="Menlo" w:eastAsia="Menlo"/>
+          <w:color w:val="10786E"/>
+          <w:sz w:val="18"/>
+        </w:rPr>
+        <w:t>120ms</w:t>
+      </w:r>
+      <w:r>
+        <w:t xml:space="preserve"> 的短 debounce；普通文本不等待媒体理解。只有当前文本明显追问最近图片、语音或文件时，才短等媒体理解，最长约 </w:t>
+      </w:r>
+      <w:r>
+        <w:rPr>
+          <w:rFonts w:ascii="Menlo" w:hAnsi="Menlo" w:eastAsia="Menlo"/>
+          <w:color w:val="10786E"/>
+          <w:sz w:val="18"/>
+        </w:rPr>
+        <w:t>900ms</w:t>
+      </w:r>
+      <w:r>
+        <w:t>。这样“早餐几点”“发定位”“我要办入住”“你好”等消息不被图片/语音解析拖慢。</w:t>
+      </w:r>
+    </w:p>
+    <w:p>
+      <w:r>
+        <w:t>兜底策略规则：知识库未命中不等于固定套话。只有酒店事实、规则、价格、政策、时效等需要资料支撑的问题，且没有可信资料时，才允许短句确认、追问一个关键细节或转人工。模型可以参考 fallback message，但不能死抄同一句，回复要像前台同事在微信里临场回答。</w:t>
       </w:r>
     </w:p>
     <w:p>

</xml_diff>

<commit_message>
fix(ai): preserve media context for follow-up replies
</commit_message>
<xml_diff>
--- a/docs/酒店AI店长与七鱼接入技术架构方案.docx
+++ b/docs/酒店AI店长与七鱼接入技术架构方案.docx
@@ -2236,12 +2236,28 @@
         <w:t>900ms</w:t>
       </w:r>
       <w:r>
-        <w:t>。这样“早餐几点”“发定位”“我要办入住”“你好”等消息不被图片/语音解析拖慢。</w:t>
+        <w:t>。如果客户先发图片/语音/文件，随后马上补“这个多少钱”“能用吗”“这是什么”“帮我看下”等短问题，应默认理解为围绕刚才媒体追问。这样“早餐几点”“发定位”“我要办入住”“你好”等独立意图不被图片/语音解析拖慢，同时图后追问不会丢媒体上下文。</w:t>
       </w:r>
     </w:p>
     <w:p>
       <w:r>
         <w:t>兜底策略规则：知识库未命中不等于固定套话。只有酒店事实、规则、价格、政策、时效等需要资料支撑的问题，且没有可信资料时，才允许短句确认、追问一个关键细节或转人工。模型可以参考 fallback message，但不能死抄同一句，回复要像前台同事在微信里临场回答。</w:t>
+      </w:r>
+    </w:p>
+    <w:p>
+      <w:r>
+        <w:t xml:space="preserve">回复聪明度训练记录见 </w:t>
+      </w:r>
+      <w:r>
+        <w:rPr>
+          <w:rFonts w:ascii="Menlo" w:hAnsi="Menlo" w:eastAsia="Menlo"/>
+          <w:color w:val="10786E"/>
+          <w:sz w:val="18"/>
+        </w:rPr>
+        <w:t>docs/design/ai-reply-smartness-training-log.md</w:t>
+      </w:r>
+      <w:r>
+        <w:t>。每次调整链路后，至少按该文档 Round 10 的 20 条混合压力样本回放一次，并记录速度、人味、聪明度、媒体关联和兜底控制得分。</w:t>
       </w:r>
     </w:p>
     <w:p>

</xml_diff>

<commit_message>
fix(ai): make light interactions less dismissive
</commit_message>
<xml_diff>
--- a/docs/酒店AI店长与七鱼接入技术架构方案.docx
+++ b/docs/酒店AI店长与七鱼接入技术架构方案.docx
@@ -2263,6 +2263,11 @@
     <w:p>
       <w:r>
         <w:t>AI 提示词要求：像酒店前台同事在微信里回消息，默认 1 句、最多 2 句，普通回复尽量 8 到 22 个字；少用“您”，优先说“你”；禁止“亲”“为您”“这边”“感谢理解”“请稍等片刻”“祝您生活愉快”等模板话术；不说“根据知识库”、不自称 AI。维修、漏水、投诉、安全场景先接住问题，再收集必要信息或转人工。</w:t>
+      </w:r>
+    </w:p>
+    <w:p>
+      <w:r>
+        <w:t>轻互动不是敷衍回复。感谢类要温和，例如“没事”“不麻烦”；确认类要利落，例如“好，我看着”；结束类要收住，例如“好，那先这样”；表情和玩笑可以轻接，但不能总是“哈哈/收到/可以”，也不要加固定尾巴。</w:t>
       </w:r>
     </w:p>
     <w:p>

</xml_diff>

<commit_message>
feat(wxwork): send mini program with store context
</commit_message>
<xml_diff>
--- a/docs/酒店AI店长与七鱼接入技术架构方案.docx
+++ b/docs/酒店AI店长与七鱼接入技术架构方案.docx
@@ -10274,6 +10274,93 @@
       </w:r>
       <w:r>
         <w:t>，再按开关发送默认小程序，最后按开关询问“要我把某某门店定位发您吗？”。欢迎里的小程序和定位都来自当前员工号绑定的变量，不是全局固定值；一百多家门店每个账号可以有自己的定位、欢迎语和小程序 payload。</w:t>
+      </w:r>
+    </w:p>
+    <w:p>
+      <w:r>
+        <w:t xml:space="preserve">老好友再次扫码链路：如果协议 SAAS 回调提供“扫码/渠道二维码进入/活码进入”事件，系统可以按 </w:t>
+      </w:r>
+      <w:r>
+        <w:rPr>
+          <w:rFonts w:ascii="Menlo" w:hAnsi="Menlo" w:eastAsia="Menlo"/>
+          <w:color w:val="10786E"/>
+          <w:sz w:val="18"/>
+        </w:rPr>
+        <w:t>guid + externalUserId + qrScene/storeId</w:t>
+      </w:r>
+      <w:r>
+        <w:t xml:space="preserve"> 识别老好友再次扫码，并在冷却周期内发送一次二次欢迎语、小程序和定位；如果协议只提供好友申请事件和普通消息事件，则老好友再次扫码但没有发消息时，AgentDesk 无法自动感知，不能凭空主动发送。此时只能在客户下一条消息到达时触发“二次欢迎/资源补发”，或把二维码改成先到 AgentDesk/小程序中转页，由中转页记录扫码事件后再引导打开企微会话。</w:t>
+      </w:r>
+    </w:p>
+    <w:p>
+      <w:r>
+        <w:t xml:space="preserve">安心宿小程序门店参数链路：直接发送小程序时，不能只发固定首页。后端在发送默认小程序前，会把当前员工号绑定的门店参数注入 </w:t>
+      </w:r>
+      <w:r>
+        <w:rPr>
+          <w:rFonts w:ascii="Menlo" w:hAnsi="Menlo" w:eastAsia="Menlo"/>
+          <w:color w:val="10786E"/>
+          <w:sz w:val="18"/>
+        </w:rPr>
+        <w:t>page_path</w:t>
+      </w:r>
+      <w:r>
+        <w:t xml:space="preserve">：至少带 </w:t>
+      </w:r>
+      <w:r>
+        <w:rPr>
+          <w:rFonts w:ascii="Menlo" w:hAnsi="Menlo" w:eastAsia="Menlo"/>
+          <w:color w:val="10786E"/>
+          <w:sz w:val="18"/>
+        </w:rPr>
+        <w:t>storeId</w:t>
+      </w:r>
+      <w:r>
+        <w:t xml:space="preserve">，如果门店表有 </w:t>
+      </w:r>
+      <w:r>
+        <w:rPr>
+          <w:rFonts w:ascii="Menlo" w:hAnsi="Menlo" w:eastAsia="Menlo"/>
+          <w:color w:val="10786E"/>
+          <w:sz w:val="18"/>
+        </w:rPr>
+        <w:t>storeCode/name</w:t>
+      </w:r>
+      <w:r>
+        <w:t xml:space="preserve">，同时带 </w:t>
+      </w:r>
+      <w:r>
+        <w:rPr>
+          <w:rFonts w:ascii="Menlo" w:hAnsi="Menlo" w:eastAsia="Menlo"/>
+          <w:color w:val="10786E"/>
+          <w:sz w:val="18"/>
+        </w:rPr>
+        <w:t>storeCode/storeName</w:t>
+      </w:r>
+      <w:r>
+        <w:t xml:space="preserve">。例如 </w:t>
+      </w:r>
+      <w:r>
+        <w:rPr>
+          <w:rFonts w:ascii="Menlo" w:hAnsi="Menlo" w:eastAsia="Menlo"/>
+          <w:color w:val="10786E"/>
+          <w:sz w:val="18"/>
+        </w:rPr>
+        <w:t>pages/index/index</w:t>
+      </w:r>
+      <w:r>
+        <w:t xml:space="preserve"> 会变成 </w:t>
+      </w:r>
+      <w:r>
+        <w:rPr>
+          <w:rFonts w:ascii="Menlo" w:hAnsi="Menlo" w:eastAsia="Menlo"/>
+          <w:color w:val="10786E"/>
+          <w:sz w:val="18"/>
+        </w:rPr>
+        <w:t>pages/index/index?storeId=88&amp;storeCode=...&amp;storeName=...</w:t>
+      </w:r>
+      <w:r>
+        <w:t>。小程序端需要读取这些 query 参数并预填“预定酒店”，这样主动发送的小程序和扫码打开一样能带门店信息。</w:t>
       </w:r>
     </w:p>
     <w:p>

</xml_diff>